<commit_message>
v1.0: paper v10 docx with Appendix A.4, event study output
</commit_message>
<xml_diff>
--- a/paper/ftx_paper_draft.docx
+++ b/paper/ftx_paper_draft.docx
@@ -704,7 +704,7 @@
         <w:jc w:val="both"/>
       </w:pPr>
       <w:r>
-        <w:t xml:space="preserve">The cumulative net outflow series first turns positive on October 18, 2022 and increases approximately monotonically through November 8, reaching a peak of approximately $500 million. Three windows are useful for characterization: a pre-news period from October 15 to November 1, a news period from November 2 (CoinDesk publication) to November 9, and a post-halt period from November 10 onward. Table 1 summarizes flow characteristics across these windows.</w:t>
+        <w:t xml:space="preserve">The cumulative net outflow series first turns positive on October 18, 2022 and increases approximately monotonically through November 8, reaching a peak of approximately $500 million. Three windows are useful for characterization: a pre-news period from October 15 to November 1, a news period from November 2 (CoinDesk publication) to November 9, and a post-halt period from November 10 onward. Table 1 summarizes flow characteristics across these windows. Endogenous breakpoint detection on the hourly transaction count series independently identifies October 18 as a structural break, providing data-driven corroboration of this date as the start of the slow-burn outflow phase (Appendix A.4).</w:t>
       </w:r>
     </w:p>
     <w:p>
@@ -3123,7 +3123,7 @@
         <w:jc w:val="both"/>
       </w:pPr>
       <w:r>
-        <w:t xml:space="preserve">Three patterns are visible. First, mean hourly absolute flow magnitude rose modestly (17%), but the median more than doubled (2.11x), indicating that hours of typical activity contained substantially more flow than before. Second, dispersion compressed sharply: standard deviation fell 31%, the maximum hourly flow fell 58% (from $177M to $74M), and both skewness and kurtosis declined materially. Third, mean transaction count per hour rose from 107 to 249, a 2.33-fold increase. Together these patterns describe a regime in which the distribution of hourly activity shifted upward and tightened: more transactions per hour, higher typical flow per hour, but fewer extreme single-hour spikes. One natural reading is that the news window was characterized by a flood of moderate-sized customer withdrawals replacing the prior regime of intermittent large transfers; we cannot distinguish customer from operational flows in the on-chain record alone, however, and offer this only as the most parsimonious interpretation of the observed distributional shift. Sub-hourly evidence reported in Appendix A.3 is consistent with this reading: the empirical distribution of transaction-level inter-arrival times tightens substantially during the news window relative to the pre-news baseline, a signature consistent with a withdrawal-processing pathway operating at or near a service-rate ceiling.</w:t>
+        <w:t xml:space="preserve">Three patterns are visible. First, mean hourly absolute flow magnitude rose modestly (17%), but the median more than doubled (2.11x), indicating that hours of typical activity contained substantially more flow than before. Second, dispersion compressed sharply: standard deviation fell 31%, the maximum hourly flow fell 58% (from $177M to $74M), and both skewness and kurtosis declined materially. Third, mean transaction count per hour rose from 107 to 249, a 2.33-fold increase. Together these patterns describe a regime in which the distribution of hourly activity shifted upward and tightened: more transactions per hour, higher typical flow per hour, but fewer extreme single-hour spikes. One natural reading is that the news window was characterized by a flood of moderate-sized customer withdrawals replacing the prior regime of intermittent large transfers; we cannot distinguish customer from operational flows in the on-chain record alone, however, and offer this only as the most parsimonious interpretation of the observed distributional shift. Sub-hourly evidence reported in Appendix A.3 is consistent with this reading: the empirical distribution of transaction-level inter-arrival times tightens substantially during the news window relative to the pre-news baseline, a signature consistent with a withdrawal-processing pathway operating at or near a service-rate ceiling. Formal structural-break tests reported in Appendix A.4 support the asymmetry between the two outcome series: the hourly transaction count series exhibits a highly significant Chow break at November 2 (F=9.65, p=0.0001), whereas the absolute flow magnitude series does not (F=1.07, p=0.34). Endogenous breakpoint detection (Bai-Perron) places the structural change at November 4 21:00 UTC rather than precisely at the November 2 CoinDesk publication; we retain November 2 as the boundary of the news window because it corresponds to a discrete public information event, while noting that the data-detected break aligns more closely with the period spanning the CoinDesk article and the November 6 CZ tweet.</w:t>
       </w:r>
     </w:p>
     <w:p>
@@ -4569,6 +4569,1049 @@
       </w:pPr>
       <w:r>
         <w:t xml:space="preserve">The distribution of transaction-level inter-arrival times tightens during the news window relative to the pre-news baseline, then lengthens substantially after the halt. Specifically, mean (median) inter-arrival time is 42.9 (36.0) seconds during the pre-news window of October 15 to November 1, with a 90th percentile of 84 seconds. During the November 2 – November 8 19:00 UTC news window, mean inter-arrival time falls to 27.5 (median 24.0) seconds, and the 90th percentile compresses to 60 seconds. After the halt, mean inter-arrival time rises to 150.1 seconds, with the median at 72 seconds and the 90th percentile at 252 seconds. The pattern—faster and more regular spacing during the news window, sparser and more dispersed spacing afterwards—is consistent with a withdrawal-processing system operating at or near a service-rate ceiling during the run, then transitioning to intermittent residual activity once the customer-facing withdrawal pathway was closed.</w:t>
+      </w:r>
+    </w:p>
+    <w:p>
+      <w:pPr>
+        <w:spacing w:after="120" w:line="300"/>
+        <w:jc w:val="both"/>
+      </w:pPr>
+      <w:r>
+        <w:t xml:space="preserve"/>
+      </w:r>
+    </w:p>
+    <w:p>
+      <w:pPr>
+        <w:spacing w:after="120" w:line="300"/>
+        <w:jc w:val="both"/>
+      </w:pPr>
+      <w:r>
+        <w:rPr>
+          <w:b/>
+          <w:bCs/>
+        </w:rPr>
+        <w:t xml:space="preserve">A.4 Event study around the November 2 disclosure</w:t>
+      </w:r>
+    </w:p>
+    <w:p>
+      <w:pPr>
+        <w:spacing w:after="120" w:line="300"/>
+        <w:jc w:val="both"/>
+      </w:pPr>
+      <w:r>
+        <w:t xml:space="preserve">To formalize the asymmetry described in Section 4.2—that the regime change following the November 2 CoinDesk disclosure manifested as a sharp increase in transaction count rather than as a proportional acceleration of average flow magnitude—we run three families of test on hourly transaction count and hourly absolute flow over the sample window October 15 to November 8 19:00 UTC (596 observations, 447 pre-event and 149 post-event hours; the operational halt period is excluded so the test isolates the disclosure regime shift from the subsequent halt). Test 1 regresses each series on a constant and a post-November-2 indicator with Newey-West HAC standard errors at 24-hour bandwidth. Test 2 is a Chow test on an AR(1) model of each series at the November 2 break date. Test 3 is an endogenous breakpoint search via grid minimization of within-segment sum of squares with BIC selection, considering up to three breaks with 15% trimming.</w:t>
+      </w:r>
+    </w:p>
+    <w:p>
+      <w:pPr>
+        <w:spacing w:after="120" w:line="300"/>
+        <w:jc w:val="both"/>
+      </w:pPr>
+      <w:r>
+        <w:t xml:space="preserve">The pre/post comparison shows a 2.77-fold increase in mean hourly transaction count (HAC t = +2.42, p = 0.015) but only a 1.31-fold increase in mean hourly absolute flow magnitude (HAC t = +1.45, p = 0.148); the formal test thus rejects the null of no change for transaction count at conventional significance but cannot reject the null for flow magnitude. The Chow test sharpens this contrast: for hourly transaction count, the F-statistic is 9.65 with p = 0.0001, decisively rejecting AR(1) coefficient stability across the November 2 break; for hourly absolute flow, the F-statistic is 1.07 with p = 0.34, well short of conventional significance. Tests 1 and 2 jointly support the qualitative reading in Section 4.2: the regime change visible at the hourly resolution is principally a count-of-transactions phenomenon rather than a magnitude-per-transaction phenomenon.</w:t>
+      </w:r>
+    </w:p>
+    <w:p>
+      <w:pPr>
+        <w:spacing w:after="120" w:line="300"/>
+        <w:jc w:val="both"/>
+      </w:pPr>
+      <w:r>
+        <w:t xml:space="preserve">The endogenous breakpoint search yields more nuanced timing. For hourly transaction count, BIC selects three breaks at October 18 18:00 UTC, October 31 16:00 UTC, and November 4 21:00 UTC. The October 18 break corroborates the date identified in Section 4.1 as the start of the slow-burn outflow phase. The November 4 break, rather than November 2, places the structural transition between the CoinDesk article (November 2 14:44 UTC) and the CZ tweet announcing FTT divestment (November 6 15:47 UTC), suggesting that the regime change was not an instantaneous response to the CoinDesk article but a transition that unfolded over the intervening days. For hourly absolute flow, BIC also selects three breaks (October 25, October 31, and November 4), but the BIC improvement over the no-break baseline is much smaller (a drop of 22 BIC units) than for transaction count (a drop of 308 BIC units), consistent with a less pronounced structural shift in the flow-magnitude series. Table A1 summarizes the test statistics.</w:t>
+      </w:r>
+    </w:p>
+    <w:p>
+      <w:pPr>
+        <w:spacing w:after="120" w:before="120"/>
+        <w:jc w:val="left"/>
+      </w:pPr>
+      <w:r>
+        <w:rPr>
+          <w:b/>
+          <w:bCs/>
+          <w:sz w:val="22"/>
+          <w:szCs w:val="22"/>
+        </w:rPr>
+        <w:t xml:space="preserve">Table A1. Event study test statistics around the November 2 disclosure</w:t>
+      </w:r>
+    </w:p>
+    <w:tbl>
+      <w:tblPr>
+        <w:tblW w:type="dxa" w:w="9360"/>
+        <w:tblBorders>
+          <w:top w:val="single" w:color="auto" w:sz="4"/>
+          <w:left w:val="single" w:color="auto" w:sz="4"/>
+          <w:bottom w:val="single" w:color="auto" w:sz="4"/>
+          <w:right w:val="single" w:color="auto" w:sz="4"/>
+          <w:insideH w:val="single" w:color="auto" w:sz="4"/>
+          <w:insideV w:val="single" w:color="auto" w:sz="4"/>
+        </w:tblBorders>
+      </w:tblPr>
+      <w:tblGrid>
+        <w:gridCol w:w="2800"/>
+        <w:gridCol w:w="1640"/>
+        <w:gridCol w:w="1640"/>
+        <w:gridCol w:w="1640"/>
+        <w:gridCol w:w="1640"/>
+      </w:tblGrid>
+      <w:tr>
+        <w:trPr>
+          <w:tblHeader/>
+        </w:trPr>
+        <w:tc>
+          <w:tcPr>
+            <w:tcW w:type="dxa" w:w="2800"/>
+            <w:tcBorders>
+              <w:top w:val="single" w:color="888888" w:sz="4"/>
+              <w:left w:val="single" w:color="888888" w:sz="4"/>
+              <w:bottom w:val="single" w:color="888888" w:sz="4"/>
+              <w:right w:val="single" w:color="888888" w:sz="4"/>
+            </w:tcBorders>
+            <w:shd w:fill="D5E8F0" w:val="clear"/>
+            <w:tcMar>
+              <w:top w:type="dxa" w:w="80"/>
+              <w:left w:type="dxa" w:w="120"/>
+              <w:bottom w:type="dxa" w:w="80"/>
+              <w:right w:type="dxa" w:w="120"/>
+            </w:tcMar>
+          </w:tcPr>
+          <w:p>
+            <w:pPr>
+              <w:jc w:val="left"/>
+            </w:pPr>
+            <w:r>
+              <w:rPr>
+                <w:b/>
+                <w:bCs/>
+                <w:sz w:val="20"/>
+                <w:szCs w:val="20"/>
+              </w:rPr>
+              <w:t xml:space="preserve">Test</w:t>
+            </w:r>
+          </w:p>
+        </w:tc>
+        <w:tc>
+          <w:tcPr>
+            <w:tcW w:type="dxa" w:w="1640"/>
+            <w:tcBorders>
+              <w:top w:val="single" w:color="888888" w:sz="4"/>
+              <w:left w:val="single" w:color="888888" w:sz="4"/>
+              <w:bottom w:val="single" w:color="888888" w:sz="4"/>
+              <w:right w:val="single" w:color="888888" w:sz="4"/>
+            </w:tcBorders>
+            <w:shd w:fill="D5E8F0" w:val="clear"/>
+            <w:tcMar>
+              <w:top w:type="dxa" w:w="80"/>
+              <w:left w:type="dxa" w:w="120"/>
+              <w:bottom w:type="dxa" w:w="80"/>
+              <w:right w:type="dxa" w:w="120"/>
+            </w:tcMar>
+          </w:tcPr>
+          <w:p>
+            <w:pPr>
+              <w:jc w:val="center"/>
+            </w:pPr>
+            <w:r>
+              <w:rPr>
+                <w:b/>
+                <w:bCs/>
+                <w:sz w:val="20"/>
+                <w:szCs w:val="20"/>
+              </w:rPr>
+              <w:t xml:space="preserve">Statistic</w:t>
+            </w:r>
+          </w:p>
+        </w:tc>
+        <w:tc>
+          <w:tcPr>
+            <w:tcW w:type="dxa" w:w="1640"/>
+            <w:tcBorders>
+              <w:top w:val="single" w:color="888888" w:sz="4"/>
+              <w:left w:val="single" w:color="888888" w:sz="4"/>
+              <w:bottom w:val="single" w:color="888888" w:sz="4"/>
+              <w:right w:val="single" w:color="888888" w:sz="4"/>
+            </w:tcBorders>
+            <w:shd w:fill="D5E8F0" w:val="clear"/>
+            <w:tcMar>
+              <w:top w:type="dxa" w:w="80"/>
+              <w:left w:type="dxa" w:w="120"/>
+              <w:bottom w:type="dxa" w:w="80"/>
+              <w:right w:type="dxa" w:w="120"/>
+            </w:tcMar>
+          </w:tcPr>
+          <w:p>
+            <w:pPr>
+              <w:jc w:val="center"/>
+            </w:pPr>
+            <w:r>
+              <w:rPr>
+                <w:b/>
+                <w:bCs/>
+                <w:sz w:val="20"/>
+                <w:szCs w:val="20"/>
+              </w:rPr>
+              <w:t xml:space="preserve">Tx count</w:t>
+            </w:r>
+          </w:p>
+        </w:tc>
+        <w:tc>
+          <w:tcPr>
+            <w:tcW w:type="dxa" w:w="1640"/>
+            <w:tcBorders>
+              <w:top w:val="single" w:color="888888" w:sz="4"/>
+              <w:left w:val="single" w:color="888888" w:sz="4"/>
+              <w:bottom w:val="single" w:color="888888" w:sz="4"/>
+              <w:right w:val="single" w:color="888888" w:sz="4"/>
+            </w:tcBorders>
+            <w:shd w:fill="D5E8F0" w:val="clear"/>
+            <w:tcMar>
+              <w:top w:type="dxa" w:w="80"/>
+              <w:left w:type="dxa" w:w="120"/>
+              <w:bottom w:type="dxa" w:w="80"/>
+              <w:right w:type="dxa" w:w="120"/>
+            </w:tcMar>
+          </w:tcPr>
+          <w:p>
+            <w:pPr>
+              <w:jc w:val="center"/>
+            </w:pPr>
+            <w:r>
+              <w:rPr>
+                <w:b/>
+                <w:bCs/>
+                <w:sz w:val="20"/>
+                <w:szCs w:val="20"/>
+              </w:rPr>
+              <w:t xml:space="preserve">Abs flow</w:t>
+            </w:r>
+          </w:p>
+        </w:tc>
+        <w:tc>
+          <w:tcPr>
+            <w:tcW w:type="dxa" w:w="1640"/>
+            <w:tcBorders>
+              <w:top w:val="single" w:color="888888" w:sz="4"/>
+              <w:left w:val="single" w:color="888888" w:sz="4"/>
+              <w:bottom w:val="single" w:color="888888" w:sz="4"/>
+              <w:right w:val="single" w:color="888888" w:sz="4"/>
+            </w:tcBorders>
+            <w:shd w:fill="D5E8F0" w:val="clear"/>
+            <w:tcMar>
+              <w:top w:type="dxa" w:w="80"/>
+              <w:left w:type="dxa" w:w="120"/>
+              <w:bottom w:type="dxa" w:w="80"/>
+              <w:right w:type="dxa" w:w="120"/>
+            </w:tcMar>
+          </w:tcPr>
+          <w:p>
+            <w:pPr>
+              <w:jc w:val="center"/>
+            </w:pPr>
+            <w:r>
+              <w:rPr>
+                <w:b/>
+                <w:bCs/>
+                <w:sz w:val="20"/>
+                <w:szCs w:val="20"/>
+              </w:rPr>
+              <w:t xml:space="preserve">Asymmetry</w:t>
+            </w:r>
+          </w:p>
+        </w:tc>
+      </w:tr>
+      <w:tr>
+        <w:tc>
+          <w:tcPr>
+            <w:tcW w:type="dxa" w:w="2800"/>
+            <w:tcBorders>
+              <w:top w:val="single" w:color="888888" w:sz="4"/>
+              <w:left w:val="single" w:color="888888" w:sz="4"/>
+              <w:bottom w:val="single" w:color="888888" w:sz="4"/>
+              <w:right w:val="single" w:color="888888" w:sz="4"/>
+            </w:tcBorders>
+            <w:tcMar>
+              <w:top w:type="dxa" w:w="80"/>
+              <w:left w:type="dxa" w:w="120"/>
+              <w:bottom w:type="dxa" w:w="80"/>
+              <w:right w:type="dxa" w:w="120"/>
+            </w:tcMar>
+          </w:tcPr>
+          <w:p>
+            <w:pPr>
+              <w:jc w:val="left"/>
+            </w:pPr>
+            <w:r>
+              <w:rPr>
+                <w:b w:val="false"/>
+                <w:bCs w:val="false"/>
+                <w:sz w:val="20"/>
+                <w:szCs w:val="20"/>
+              </w:rPr>
+              <w:t xml:space="preserve">Pre/post HAC t-test</w:t>
+            </w:r>
+          </w:p>
+        </w:tc>
+        <w:tc>
+          <w:tcPr>
+            <w:tcW w:type="dxa" w:w="1640"/>
+            <w:tcBorders>
+              <w:top w:val="single" w:color="888888" w:sz="4"/>
+              <w:left w:val="single" w:color="888888" w:sz="4"/>
+              <w:bottom w:val="single" w:color="888888" w:sz="4"/>
+              <w:right w:val="single" w:color="888888" w:sz="4"/>
+            </w:tcBorders>
+            <w:tcMar>
+              <w:top w:type="dxa" w:w="80"/>
+              <w:left w:type="dxa" w:w="120"/>
+              <w:bottom w:type="dxa" w:w="80"/>
+              <w:right w:type="dxa" w:w="120"/>
+            </w:tcMar>
+          </w:tcPr>
+          <w:p>
+            <w:pPr>
+              <w:jc w:val="center"/>
+            </w:pPr>
+            <w:r>
+              <w:rPr>
+                <w:b w:val="false"/>
+                <w:bCs w:val="false"/>
+                <w:sz w:val="20"/>
+                <w:szCs w:val="20"/>
+              </w:rPr>
+              <w:t xml:space="preserve">Ratio</w:t>
+            </w:r>
+          </w:p>
+        </w:tc>
+        <w:tc>
+          <w:tcPr>
+            <w:tcW w:type="dxa" w:w="1640"/>
+            <w:tcBorders>
+              <w:top w:val="single" w:color="888888" w:sz="4"/>
+              <w:left w:val="single" w:color="888888" w:sz="4"/>
+              <w:bottom w:val="single" w:color="888888" w:sz="4"/>
+              <w:right w:val="single" w:color="888888" w:sz="4"/>
+            </w:tcBorders>
+            <w:tcMar>
+              <w:top w:type="dxa" w:w="80"/>
+              <w:left w:type="dxa" w:w="120"/>
+              <w:bottom w:type="dxa" w:w="80"/>
+              <w:right w:type="dxa" w:w="120"/>
+            </w:tcMar>
+          </w:tcPr>
+          <w:p>
+            <w:pPr>
+              <w:jc w:val="center"/>
+            </w:pPr>
+            <w:r>
+              <w:rPr>
+                <w:b w:val="false"/>
+                <w:bCs w:val="false"/>
+                <w:sz w:val="20"/>
+                <w:szCs w:val="20"/>
+              </w:rPr>
+              <w:t xml:space="preserve">2.77</w:t>
+            </w:r>
+          </w:p>
+        </w:tc>
+        <w:tc>
+          <w:tcPr>
+            <w:tcW w:type="dxa" w:w="1640"/>
+            <w:tcBorders>
+              <w:top w:val="single" w:color="888888" w:sz="4"/>
+              <w:left w:val="single" w:color="888888" w:sz="4"/>
+              <w:bottom w:val="single" w:color="888888" w:sz="4"/>
+              <w:right w:val="single" w:color="888888" w:sz="4"/>
+            </w:tcBorders>
+            <w:tcMar>
+              <w:top w:type="dxa" w:w="80"/>
+              <w:left w:type="dxa" w:w="120"/>
+              <w:bottom w:type="dxa" w:w="80"/>
+              <w:right w:type="dxa" w:w="120"/>
+            </w:tcMar>
+          </w:tcPr>
+          <w:p>
+            <w:pPr>
+              <w:jc w:val="center"/>
+            </w:pPr>
+            <w:r>
+              <w:rPr>
+                <w:b w:val="false"/>
+                <w:bCs w:val="false"/>
+                <w:sz w:val="20"/>
+                <w:szCs w:val="20"/>
+              </w:rPr>
+              <w:t xml:space="preserve">1.31</w:t>
+            </w:r>
+          </w:p>
+        </w:tc>
+        <w:tc>
+          <w:tcPr>
+            <w:tcW w:type="dxa" w:w="1640"/>
+            <w:tcBorders>
+              <w:top w:val="single" w:color="888888" w:sz="4"/>
+              <w:left w:val="single" w:color="888888" w:sz="4"/>
+              <w:bottom w:val="single" w:color="888888" w:sz="4"/>
+              <w:right w:val="single" w:color="888888" w:sz="4"/>
+            </w:tcBorders>
+            <w:tcMar>
+              <w:top w:type="dxa" w:w="80"/>
+              <w:left w:type="dxa" w:w="120"/>
+              <w:bottom w:type="dxa" w:w="80"/>
+              <w:right w:type="dxa" w:w="120"/>
+            </w:tcMar>
+          </w:tcPr>
+          <w:p>
+            <w:pPr>
+              <w:jc w:val="center"/>
+            </w:pPr>
+            <w:r>
+              <w:rPr>
+                <w:b w:val="false"/>
+                <w:bCs w:val="false"/>
+                <w:sz w:val="20"/>
+                <w:szCs w:val="20"/>
+              </w:rPr>
+              <w:t xml:space="preserve">Yes</w:t>
+            </w:r>
+          </w:p>
+        </w:tc>
+      </w:tr>
+      <w:tr>
+        <w:tc>
+          <w:tcPr>
+            <w:tcW w:type="dxa" w:w="2800"/>
+            <w:tcBorders>
+              <w:top w:val="single" w:color="888888" w:sz="4"/>
+              <w:left w:val="single" w:color="888888" w:sz="4"/>
+              <w:bottom w:val="single" w:color="888888" w:sz="4"/>
+              <w:right w:val="single" w:color="888888" w:sz="4"/>
+            </w:tcBorders>
+            <w:tcMar>
+              <w:top w:type="dxa" w:w="80"/>
+              <w:left w:type="dxa" w:w="120"/>
+              <w:bottom w:type="dxa" w:w="80"/>
+              <w:right w:type="dxa" w:w="120"/>
+            </w:tcMar>
+          </w:tcPr>
+          <w:p>
+            <w:pPr>
+              <w:jc w:val="left"/>
+            </w:pPr>
+            <w:r>
+              <w:rPr>
+                <w:b w:val="false"/>
+                <w:bCs w:val="false"/>
+                <w:sz w:val="20"/>
+                <w:szCs w:val="20"/>
+              </w:rPr>
+              <w:t xml:space="preserve">Pre/post HAC t-test</w:t>
+            </w:r>
+          </w:p>
+        </w:tc>
+        <w:tc>
+          <w:tcPr>
+            <w:tcW w:type="dxa" w:w="1640"/>
+            <w:tcBorders>
+              <w:top w:val="single" w:color="888888" w:sz="4"/>
+              <w:left w:val="single" w:color="888888" w:sz="4"/>
+              <w:bottom w:val="single" w:color="888888" w:sz="4"/>
+              <w:right w:val="single" w:color="888888" w:sz="4"/>
+            </w:tcBorders>
+            <w:tcMar>
+              <w:top w:type="dxa" w:w="80"/>
+              <w:left w:type="dxa" w:w="120"/>
+              <w:bottom w:type="dxa" w:w="80"/>
+              <w:right w:type="dxa" w:w="120"/>
+            </w:tcMar>
+          </w:tcPr>
+          <w:p>
+            <w:pPr>
+              <w:jc w:val="center"/>
+            </w:pPr>
+            <w:r>
+              <w:rPr>
+                <w:b w:val="false"/>
+                <w:bCs w:val="false"/>
+                <w:sz w:val="20"/>
+                <w:szCs w:val="20"/>
+              </w:rPr>
+              <w:t xml:space="preserve">t (p-value)</w:t>
+            </w:r>
+          </w:p>
+        </w:tc>
+        <w:tc>
+          <w:tcPr>
+            <w:tcW w:type="dxa" w:w="1640"/>
+            <w:tcBorders>
+              <w:top w:val="single" w:color="888888" w:sz="4"/>
+              <w:left w:val="single" w:color="888888" w:sz="4"/>
+              <w:bottom w:val="single" w:color="888888" w:sz="4"/>
+              <w:right w:val="single" w:color="888888" w:sz="4"/>
+            </w:tcBorders>
+            <w:tcMar>
+              <w:top w:type="dxa" w:w="80"/>
+              <w:left w:type="dxa" w:w="120"/>
+              <w:bottom w:type="dxa" w:w="80"/>
+              <w:right w:type="dxa" w:w="120"/>
+            </w:tcMar>
+          </w:tcPr>
+          <w:p>
+            <w:pPr>
+              <w:jc w:val="center"/>
+            </w:pPr>
+            <w:r>
+              <w:rPr>
+                <w:b w:val="false"/>
+                <w:bCs w:val="false"/>
+                <w:sz w:val="20"/>
+                <w:szCs w:val="20"/>
+              </w:rPr>
+              <w:t xml:space="preserve">+2.42 (0.015)</w:t>
+            </w:r>
+          </w:p>
+        </w:tc>
+        <w:tc>
+          <w:tcPr>
+            <w:tcW w:type="dxa" w:w="1640"/>
+            <w:tcBorders>
+              <w:top w:val="single" w:color="888888" w:sz="4"/>
+              <w:left w:val="single" w:color="888888" w:sz="4"/>
+              <w:bottom w:val="single" w:color="888888" w:sz="4"/>
+              <w:right w:val="single" w:color="888888" w:sz="4"/>
+            </w:tcBorders>
+            <w:tcMar>
+              <w:top w:type="dxa" w:w="80"/>
+              <w:left w:type="dxa" w:w="120"/>
+              <w:bottom w:type="dxa" w:w="80"/>
+              <w:right w:type="dxa" w:w="120"/>
+            </w:tcMar>
+          </w:tcPr>
+          <w:p>
+            <w:pPr>
+              <w:jc w:val="center"/>
+            </w:pPr>
+            <w:r>
+              <w:rPr>
+                <w:b w:val="false"/>
+                <w:bCs w:val="false"/>
+                <w:sz w:val="20"/>
+                <w:szCs w:val="20"/>
+              </w:rPr>
+              <w:t xml:space="preserve">+1.45 (0.148)</w:t>
+            </w:r>
+          </w:p>
+        </w:tc>
+        <w:tc>
+          <w:tcPr>
+            <w:tcW w:type="dxa" w:w="1640"/>
+            <w:tcBorders>
+              <w:top w:val="single" w:color="888888" w:sz="4"/>
+              <w:left w:val="single" w:color="888888" w:sz="4"/>
+              <w:bottom w:val="single" w:color="888888" w:sz="4"/>
+              <w:right w:val="single" w:color="888888" w:sz="4"/>
+            </w:tcBorders>
+            <w:tcMar>
+              <w:top w:type="dxa" w:w="80"/>
+              <w:left w:type="dxa" w:w="120"/>
+              <w:bottom w:type="dxa" w:w="80"/>
+              <w:right w:type="dxa" w:w="120"/>
+            </w:tcMar>
+          </w:tcPr>
+          <w:p>
+            <w:pPr>
+              <w:jc w:val="center"/>
+            </w:pPr>
+            <w:r>
+              <w:rPr>
+                <w:b w:val="false"/>
+                <w:bCs w:val="false"/>
+                <w:sz w:val="20"/>
+                <w:szCs w:val="20"/>
+              </w:rPr>
+              <w:t xml:space="preserve">Yes</w:t>
+            </w:r>
+          </w:p>
+        </w:tc>
+      </w:tr>
+      <w:tr>
+        <w:tc>
+          <w:tcPr>
+            <w:tcW w:type="dxa" w:w="2800"/>
+            <w:tcBorders>
+              <w:top w:val="single" w:color="888888" w:sz="4"/>
+              <w:left w:val="single" w:color="888888" w:sz="4"/>
+              <w:bottom w:val="single" w:color="888888" w:sz="4"/>
+              <w:right w:val="single" w:color="888888" w:sz="4"/>
+            </w:tcBorders>
+            <w:tcMar>
+              <w:top w:type="dxa" w:w="80"/>
+              <w:left w:type="dxa" w:w="120"/>
+              <w:bottom w:type="dxa" w:w="80"/>
+              <w:right w:type="dxa" w:w="120"/>
+            </w:tcMar>
+          </w:tcPr>
+          <w:p>
+            <w:pPr>
+              <w:jc w:val="left"/>
+            </w:pPr>
+            <w:r>
+              <w:rPr>
+                <w:b w:val="false"/>
+                <w:bCs w:val="false"/>
+                <w:sz w:val="20"/>
+                <w:szCs w:val="20"/>
+              </w:rPr>
+              <w:t xml:space="preserve">Chow test on AR(1) at Nov 2</w:t>
+            </w:r>
+          </w:p>
+        </w:tc>
+        <w:tc>
+          <w:tcPr>
+            <w:tcW w:type="dxa" w:w="1640"/>
+            <w:tcBorders>
+              <w:top w:val="single" w:color="888888" w:sz="4"/>
+              <w:left w:val="single" w:color="888888" w:sz="4"/>
+              <w:bottom w:val="single" w:color="888888" w:sz="4"/>
+              <w:right w:val="single" w:color="888888" w:sz="4"/>
+            </w:tcBorders>
+            <w:tcMar>
+              <w:top w:type="dxa" w:w="80"/>
+              <w:left w:type="dxa" w:w="120"/>
+              <w:bottom w:type="dxa" w:w="80"/>
+              <w:right w:type="dxa" w:w="120"/>
+            </w:tcMar>
+          </w:tcPr>
+          <w:p>
+            <w:pPr>
+              <w:jc w:val="center"/>
+            </w:pPr>
+            <w:r>
+              <w:rPr>
+                <w:b w:val="false"/>
+                <w:bCs w:val="false"/>
+                <w:sz w:val="20"/>
+                <w:szCs w:val="20"/>
+              </w:rPr>
+              <w:t xml:space="preserve">F (p-value)</w:t>
+            </w:r>
+          </w:p>
+        </w:tc>
+        <w:tc>
+          <w:tcPr>
+            <w:tcW w:type="dxa" w:w="1640"/>
+            <w:tcBorders>
+              <w:top w:val="single" w:color="888888" w:sz="4"/>
+              <w:left w:val="single" w:color="888888" w:sz="4"/>
+              <w:bottom w:val="single" w:color="888888" w:sz="4"/>
+              <w:right w:val="single" w:color="888888" w:sz="4"/>
+            </w:tcBorders>
+            <w:tcMar>
+              <w:top w:type="dxa" w:w="80"/>
+              <w:left w:type="dxa" w:w="120"/>
+              <w:bottom w:type="dxa" w:w="80"/>
+              <w:right w:type="dxa" w:w="120"/>
+            </w:tcMar>
+          </w:tcPr>
+          <w:p>
+            <w:pPr>
+              <w:jc w:val="center"/>
+            </w:pPr>
+            <w:r>
+              <w:rPr>
+                <w:b w:val="false"/>
+                <w:bCs w:val="false"/>
+                <w:sz w:val="20"/>
+                <w:szCs w:val="20"/>
+              </w:rPr>
+              <w:t xml:space="preserve">9.65 (0.0001)</w:t>
+            </w:r>
+          </w:p>
+        </w:tc>
+        <w:tc>
+          <w:tcPr>
+            <w:tcW w:type="dxa" w:w="1640"/>
+            <w:tcBorders>
+              <w:top w:val="single" w:color="888888" w:sz="4"/>
+              <w:left w:val="single" w:color="888888" w:sz="4"/>
+              <w:bottom w:val="single" w:color="888888" w:sz="4"/>
+              <w:right w:val="single" w:color="888888" w:sz="4"/>
+            </w:tcBorders>
+            <w:tcMar>
+              <w:top w:type="dxa" w:w="80"/>
+              <w:left w:type="dxa" w:w="120"/>
+              <w:bottom w:type="dxa" w:w="80"/>
+              <w:right w:type="dxa" w:w="120"/>
+            </w:tcMar>
+          </w:tcPr>
+          <w:p>
+            <w:pPr>
+              <w:jc w:val="center"/>
+            </w:pPr>
+            <w:r>
+              <w:rPr>
+                <w:b w:val="false"/>
+                <w:bCs w:val="false"/>
+                <w:sz w:val="20"/>
+                <w:szCs w:val="20"/>
+              </w:rPr>
+              <w:t xml:space="preserve">1.07 (0.344)</w:t>
+            </w:r>
+          </w:p>
+        </w:tc>
+        <w:tc>
+          <w:tcPr>
+            <w:tcW w:type="dxa" w:w="1640"/>
+            <w:tcBorders>
+              <w:top w:val="single" w:color="888888" w:sz="4"/>
+              <w:left w:val="single" w:color="888888" w:sz="4"/>
+              <w:bottom w:val="single" w:color="888888" w:sz="4"/>
+              <w:right w:val="single" w:color="888888" w:sz="4"/>
+            </w:tcBorders>
+            <w:tcMar>
+              <w:top w:type="dxa" w:w="80"/>
+              <w:left w:type="dxa" w:w="120"/>
+              <w:bottom w:type="dxa" w:w="80"/>
+              <w:right w:type="dxa" w:w="120"/>
+            </w:tcMar>
+          </w:tcPr>
+          <w:p>
+            <w:pPr>
+              <w:jc w:val="center"/>
+            </w:pPr>
+            <w:r>
+              <w:rPr>
+                <w:b w:val="false"/>
+                <w:bCs w:val="false"/>
+                <w:sz w:val="20"/>
+                <w:szCs w:val="20"/>
+              </w:rPr>
+              <w:t xml:space="preserve">Yes</w:t>
+            </w:r>
+          </w:p>
+        </w:tc>
+      </w:tr>
+      <w:tr>
+        <w:tc>
+          <w:tcPr>
+            <w:tcW w:type="dxa" w:w="2800"/>
+            <w:tcBorders>
+              <w:top w:val="single" w:color="888888" w:sz="4"/>
+              <w:left w:val="single" w:color="888888" w:sz="4"/>
+              <w:bottom w:val="single" w:color="888888" w:sz="4"/>
+              <w:right w:val="single" w:color="888888" w:sz="4"/>
+            </w:tcBorders>
+            <w:tcMar>
+              <w:top w:type="dxa" w:w="80"/>
+              <w:left w:type="dxa" w:w="120"/>
+              <w:bottom w:type="dxa" w:w="80"/>
+              <w:right w:type="dxa" w:w="120"/>
+            </w:tcMar>
+          </w:tcPr>
+          <w:p>
+            <w:pPr>
+              <w:jc w:val="left"/>
+            </w:pPr>
+            <w:r>
+              <w:rPr>
+                <w:b w:val="false"/>
+                <w:bCs w:val="false"/>
+                <w:sz w:val="20"/>
+                <w:szCs w:val="20"/>
+              </w:rPr>
+              <w:t xml:space="preserve">Bai-Perron grid (BIC)</w:t>
+            </w:r>
+          </w:p>
+        </w:tc>
+        <w:tc>
+          <w:tcPr>
+            <w:tcW w:type="dxa" w:w="1640"/>
+            <w:tcBorders>
+              <w:top w:val="single" w:color="888888" w:sz="4"/>
+              <w:left w:val="single" w:color="888888" w:sz="4"/>
+              <w:bottom w:val="single" w:color="888888" w:sz="4"/>
+              <w:right w:val="single" w:color="888888" w:sz="4"/>
+            </w:tcBorders>
+            <w:tcMar>
+              <w:top w:type="dxa" w:w="80"/>
+              <w:left w:type="dxa" w:w="120"/>
+              <w:bottom w:type="dxa" w:w="80"/>
+              <w:right w:type="dxa" w:w="120"/>
+            </w:tcMar>
+          </w:tcPr>
+          <w:p>
+            <w:pPr>
+              <w:jc w:val="center"/>
+            </w:pPr>
+            <w:r>
+              <w:rPr>
+                <w:b w:val="false"/>
+                <w:bCs w:val="false"/>
+                <w:sz w:val="20"/>
+                <w:szCs w:val="20"/>
+              </w:rPr>
+              <w:t xml:space="preserve">ΔBIC vs k=0</w:t>
+            </w:r>
+          </w:p>
+        </w:tc>
+        <w:tc>
+          <w:tcPr>
+            <w:tcW w:type="dxa" w:w="1640"/>
+            <w:tcBorders>
+              <w:top w:val="single" w:color="888888" w:sz="4"/>
+              <w:left w:val="single" w:color="888888" w:sz="4"/>
+              <w:bottom w:val="single" w:color="888888" w:sz="4"/>
+              <w:right w:val="single" w:color="888888" w:sz="4"/>
+            </w:tcBorders>
+            <w:tcMar>
+              <w:top w:type="dxa" w:w="80"/>
+              <w:left w:type="dxa" w:w="120"/>
+              <w:bottom w:type="dxa" w:w="80"/>
+              <w:right w:type="dxa" w:w="120"/>
+            </w:tcMar>
+          </w:tcPr>
+          <w:p>
+            <w:pPr>
+              <w:jc w:val="center"/>
+            </w:pPr>
+            <w:r>
+              <w:rPr>
+                <w:b w:val="false"/>
+                <w:bCs w:val="false"/>
+                <w:sz w:val="20"/>
+                <w:szCs w:val="20"/>
+              </w:rPr>
+              <w:t xml:space="preserve">−308</w:t>
+            </w:r>
+          </w:p>
+        </w:tc>
+        <w:tc>
+          <w:tcPr>
+            <w:tcW w:type="dxa" w:w="1640"/>
+            <w:tcBorders>
+              <w:top w:val="single" w:color="888888" w:sz="4"/>
+              <w:left w:val="single" w:color="888888" w:sz="4"/>
+              <w:bottom w:val="single" w:color="888888" w:sz="4"/>
+              <w:right w:val="single" w:color="888888" w:sz="4"/>
+            </w:tcBorders>
+            <w:tcMar>
+              <w:top w:type="dxa" w:w="80"/>
+              <w:left w:type="dxa" w:w="120"/>
+              <w:bottom w:type="dxa" w:w="80"/>
+              <w:right w:type="dxa" w:w="120"/>
+            </w:tcMar>
+          </w:tcPr>
+          <w:p>
+            <w:pPr>
+              <w:jc w:val="center"/>
+            </w:pPr>
+            <w:r>
+              <w:rPr>
+                <w:b w:val="false"/>
+                <w:bCs w:val="false"/>
+                <w:sz w:val="20"/>
+                <w:szCs w:val="20"/>
+              </w:rPr>
+              <w:t xml:space="preserve">−22</w:t>
+            </w:r>
+          </w:p>
+        </w:tc>
+        <w:tc>
+          <w:tcPr>
+            <w:tcW w:type="dxa" w:w="1640"/>
+            <w:tcBorders>
+              <w:top w:val="single" w:color="888888" w:sz="4"/>
+              <w:left w:val="single" w:color="888888" w:sz="4"/>
+              <w:bottom w:val="single" w:color="888888" w:sz="4"/>
+              <w:right w:val="single" w:color="888888" w:sz="4"/>
+            </w:tcBorders>
+            <w:tcMar>
+              <w:top w:type="dxa" w:w="80"/>
+              <w:left w:type="dxa" w:w="120"/>
+              <w:bottom w:type="dxa" w:w="80"/>
+              <w:right w:type="dxa" w:w="120"/>
+            </w:tcMar>
+          </w:tcPr>
+          <w:p>
+            <w:pPr>
+              <w:jc w:val="center"/>
+            </w:pPr>
+            <w:r>
+              <w:rPr>
+                <w:b w:val="false"/>
+                <w:bCs w:val="false"/>
+                <w:sz w:val="20"/>
+                <w:szCs w:val="20"/>
+              </w:rPr>
+              <w:t xml:space="preserve">Yes</w:t>
+            </w:r>
+          </w:p>
+        </w:tc>
+      </w:tr>
+      <w:tr>
+        <w:tc>
+          <w:tcPr>
+            <w:tcW w:type="dxa" w:w="2800"/>
+            <w:tcBorders>
+              <w:top w:val="single" w:color="888888" w:sz="4"/>
+              <w:left w:val="single" w:color="888888" w:sz="4"/>
+              <w:bottom w:val="single" w:color="888888" w:sz="4"/>
+              <w:right w:val="single" w:color="888888" w:sz="4"/>
+            </w:tcBorders>
+            <w:tcMar>
+              <w:top w:type="dxa" w:w="80"/>
+              <w:left w:type="dxa" w:w="120"/>
+              <w:bottom w:type="dxa" w:w="80"/>
+              <w:right w:type="dxa" w:w="120"/>
+            </w:tcMar>
+          </w:tcPr>
+          <w:p>
+            <w:pPr>
+              <w:jc w:val="left"/>
+            </w:pPr>
+            <w:r>
+              <w:rPr>
+                <w:b w:val="false"/>
+                <w:bCs w:val="false"/>
+                <w:sz w:val="20"/>
+                <w:szCs w:val="20"/>
+              </w:rPr>
+              <w:t xml:space="preserve">Bai-Perron grid (BIC)</w:t>
+            </w:r>
+          </w:p>
+        </w:tc>
+        <w:tc>
+          <w:tcPr>
+            <w:tcW w:type="dxa" w:w="1640"/>
+            <w:tcBorders>
+              <w:top w:val="single" w:color="888888" w:sz="4"/>
+              <w:left w:val="single" w:color="888888" w:sz="4"/>
+              <w:bottom w:val="single" w:color="888888" w:sz="4"/>
+              <w:right w:val="single" w:color="888888" w:sz="4"/>
+            </w:tcBorders>
+            <w:tcMar>
+              <w:top w:type="dxa" w:w="80"/>
+              <w:left w:type="dxa" w:w="120"/>
+              <w:bottom w:type="dxa" w:w="80"/>
+              <w:right w:type="dxa" w:w="120"/>
+            </w:tcMar>
+          </w:tcPr>
+          <w:p>
+            <w:pPr>
+              <w:jc w:val="center"/>
+            </w:pPr>
+            <w:r>
+              <w:rPr>
+                <w:b w:val="false"/>
+                <w:bCs w:val="false"/>
+                <w:sz w:val="20"/>
+                <w:szCs w:val="20"/>
+              </w:rPr>
+              <w:t xml:space="preserve">Selected breaks</w:t>
+            </w:r>
+          </w:p>
+        </w:tc>
+        <w:tc>
+          <w:tcPr>
+            <w:tcW w:type="dxa" w:w="1640"/>
+            <w:tcBorders>
+              <w:top w:val="single" w:color="888888" w:sz="4"/>
+              <w:left w:val="single" w:color="888888" w:sz="4"/>
+              <w:bottom w:val="single" w:color="888888" w:sz="4"/>
+              <w:right w:val="single" w:color="888888" w:sz="4"/>
+            </w:tcBorders>
+            <w:tcMar>
+              <w:top w:type="dxa" w:w="80"/>
+              <w:left w:type="dxa" w:w="120"/>
+              <w:bottom w:type="dxa" w:w="80"/>
+              <w:right w:type="dxa" w:w="120"/>
+            </w:tcMar>
+          </w:tcPr>
+          <w:p>
+            <w:pPr>
+              <w:jc w:val="center"/>
+            </w:pPr>
+            <w:r>
+              <w:rPr>
+                <w:b w:val="false"/>
+                <w:bCs w:val="false"/>
+                <w:sz w:val="20"/>
+                <w:szCs w:val="20"/>
+              </w:rPr>
+              <w:t xml:space="preserve">Oct 18, Oct 31, Nov 4</w:t>
+            </w:r>
+          </w:p>
+        </w:tc>
+        <w:tc>
+          <w:tcPr>
+            <w:tcW w:type="dxa" w:w="1640"/>
+            <w:tcBorders>
+              <w:top w:val="single" w:color="888888" w:sz="4"/>
+              <w:left w:val="single" w:color="888888" w:sz="4"/>
+              <w:bottom w:val="single" w:color="888888" w:sz="4"/>
+              <w:right w:val="single" w:color="888888" w:sz="4"/>
+            </w:tcBorders>
+            <w:tcMar>
+              <w:top w:type="dxa" w:w="80"/>
+              <w:left w:type="dxa" w:w="120"/>
+              <w:bottom w:type="dxa" w:w="80"/>
+              <w:right w:type="dxa" w:w="120"/>
+            </w:tcMar>
+          </w:tcPr>
+          <w:p>
+            <w:pPr>
+              <w:jc w:val="center"/>
+            </w:pPr>
+            <w:r>
+              <w:rPr>
+                <w:b w:val="false"/>
+                <w:bCs w:val="false"/>
+                <w:sz w:val="20"/>
+                <w:szCs w:val="20"/>
+              </w:rPr>
+              <w:t xml:space="preserve">Oct 25, Oct 31, Nov 4</w:t>
+            </w:r>
+          </w:p>
+        </w:tc>
+        <w:tc>
+          <w:tcPr>
+            <w:tcW w:type="dxa" w:w="1640"/>
+            <w:tcBorders>
+              <w:top w:val="single" w:color="888888" w:sz="4"/>
+              <w:left w:val="single" w:color="888888" w:sz="4"/>
+              <w:bottom w:val="single" w:color="888888" w:sz="4"/>
+              <w:right w:val="single" w:color="888888" w:sz="4"/>
+            </w:tcBorders>
+            <w:tcMar>
+              <w:top w:type="dxa" w:w="80"/>
+              <w:left w:type="dxa" w:w="120"/>
+              <w:bottom w:type="dxa" w:w="80"/>
+              <w:right w:type="dxa" w:w="120"/>
+            </w:tcMar>
+          </w:tcPr>
+          <w:p>
+            <w:pPr>
+              <w:jc w:val="center"/>
+            </w:pPr>
+            <w:r>
+              <w:rPr>
+                <w:b w:val="false"/>
+                <w:bCs w:val="false"/>
+                <w:sz w:val="20"/>
+                <w:szCs w:val="20"/>
+              </w:rPr>
+              <w:t xml:space="preserve">Partial</w:t>
+            </w:r>
+          </w:p>
+        </w:tc>
+      </w:tr>
+    </w:tbl>
+    <w:p>
+      <w:pPr>
+        <w:spacing w:after="120" w:line="300"/>
+        <w:jc w:val="both"/>
+      </w:pPr>
+      <w:r>
+        <w:t xml:space="preserve">HAC bandwidth is 24 hours. Bai-Perron is implemented as a grid minimization of within-segment SSR with greedy continuation for k &gt; 1 and 15% trimming at each endpoint; full Bai-Perron with dynamic programming would refine the precise breakpoints but is unlikely to change the qualitative ranking by BIC.</w:t>
       </w:r>
     </w:p>
     <w:p>

</xml_diff>